<commit_message>
Submission report v5: copy edits
Final-pass copy edits before submission:

- §7.4 heading: "robust to" -> "unchanged by" (clearer claim about
  entity masking ablation)
- §1, §3.4: CIK and AAER defined on first use (Central Index Key,
  Accounting and Auditing Enforcement Release)
- Pronoun-opener cleanups: replaced "This is/It is" sentence starts
  with explicit subjects ("The result is/The model is") for clarity

Page count unchanged at 16, em-dash count unchanged at zero.
</commit_message>
<xml_diff>
--- a/reports/canary_report_short.docx
+++ b/reports/canary_report_short.docx
@@ -163,7 +163,7 @@
           <w:sz w:val="24"/>
           <w:szCs w:val="24"/>
         </w:rPr>
-        <w:t xml:space="preserve">The Management's Discussion and Analysis (MD&amp;A) section of a 10-K is the longest stretch of free-form prose in a public company's annual report. It is Item 7 in the standard SEC form, where management explains the year in their own words. A literature in accounting and finance argues that companies that later turn out to have been committing fraud leave detectable linguistic fingerprints in their pre-discovery filings. The natural question is whether unsupervised novelty detection, treated as sentence embeddings plus a reconstruction-error model trained on clean filings, can recover that fingerprint without ever seeing a fraud label.</w:t>
+        <w:t xml:space="preserve">The Management's Discussion and Analysis (MD&amp;A) section of a 10-K is the longest stretch of free-form prose in a public company's annual report. The MD&amp;A is Item 7 in the standard SEC form, where management explains the year in their own words. A literature in accounting and finance argues that companies that later turn out to have been committing fraud leave detectable linguistic fingerprints in their pre-discovery filings. The natural question is whether unsupervised novelty detection, treated as sentence embeddings plus a reconstruction-error model trained on clean filings, can recover that fingerprint without ever seeing a fraud label.</w:t>
       </w:r>
     </w:p>
     <w:p>
@@ -235,7 +235,7 @@
           <w:sz w:val="24"/>
           <w:szCs w:val="24"/>
         </w:rPr>
-        <w:t xml:space="preserve">This is not a fraud detector. It is a comparative novelty study with N = 6 positive examples, evaluated as a held-out probe set under a contract that was written down and immutable before any number was looked at. The discipline of the contract is the deliverable; the numbers it produced are evidence the contract held.</w:t>
+        <w:t xml:space="preserve">Canary is not a fraud detector. The project is a comparative novelty study with N = 6 positive examples, evaluated as a held-out probe set under a contract that was written down and immutable before any number was looked at. The discipline of the contract is the deliverable; the numbers it produced are evidence the contract held.</w:t>
       </w:r>
     </w:p>
     <w:p>
@@ -635,7 +635,7 @@
           <w:sz w:val="24"/>
           <w:szCs w:val="24"/>
         </w:rPr>
-        <w:t xml:space="preserve">A peer is admitted to a cohort iff three rules hold: the CIK is not on an editable AAER deny-list (sourced from public knowledge of SEC enforcement releases); the same CIK has filed no Form 10-K/A within five years post-filing; the CIK or company name is not on an editable class-action deny-list. Both deny-lists are committed at data/processed/aaer_denylist.txt and data/processed/classaction_denylist.txt.</w:t>
+        <w:t xml:space="preserve">A peer is admitted to a cohort iff three rules hold: the CIK (Central Index Key, the SEC's per-company identifier) is not on an editable AAER (Accounting and Auditing Enforcement Releases) deny-list (sourced from public knowledge of SEC enforcement releases); the same CIK has filed no Form 10-K/A within five years post-filing; the CIK or company name is not on an editable class-action deny-list. Both deny-lists are committed at data/processed/aaer_denylist.txt and data/processed/classaction_denylist.txt.</w:t>
       </w:r>
     </w:p>
     <w:p>
@@ -2204,7 +2204,7 @@
           <w:sz w:val="24"/>
           <w:szCs w:val="24"/>
         </w:rPr>
-        <w:t xml:space="preserve">Two limitations of the data construction matter for interpretation. First, AAER and class-action screening were applied via editable deny-lists rather than systematic database lookups; a peer that committed undisclosed fraud could appear in a cohort, which would push the null toward zero (peers behave more like frauds) and make the test conservative. Second, EDGAR reports each company's currently-reported SIC, which may differ from its at-time-of-filing SIC. I use what EDGAR currently reports and apply it symmetrically across fraud and peer filings. This is the cleanest available rule, though not a perfect control for sector-at-filing.</w:t>
+        <w:t xml:space="preserve">Two limitations of the data construction matter for interpretation. First, AAER and class-action screening were applied via editable deny-lists rather than systematic database lookups. A peer that committed undisclosed fraud could appear in a cohort and push the null toward zero, making the test conservative. Second, EDGAR reports each company's currently-reported SIC, which may differ from its at-time-of-filing SIC. I use what EDGAR currently reports and apply it symmetrically across fraud and peer filings. The rule above is the cleanest available, though not a perfect control for the firm's sector at the time of filing.</w:t>
       </w:r>
     </w:p>
     <w:p>
@@ -2494,7 +2494,7 @@
           <w:sz w:val="24"/>
           <w:szCs w:val="24"/>
         </w:rPr>
-        <w:t xml:space="preserve">This is the correct outcome of the contract, not a workaround for missing data. The honest reading is uncomfortable: the pre-registered design was infeasible for the most famous fraud in the dataset, and the design freeze did not catch the consequence. That is a finding about pre-registration, not fraud detection. It also illustrates a generalizable problem in held-out evaluation under temporal constraints. When held-out positive examples include the chronologically earliest one in the eligible universe, time-controlled training has no out-of-sample data to consume.</w:t>
+        <w:t xml:space="preserve">That outcome is correct under the contract, not a workaround for missing data. The honest reading is uncomfortable: the pre-registered design was infeasible for the most famous fraud in the dataset, and the design freeze did not catch the consequence. That is a finding about pre-registration, not fraud detection. It also illustrates a generalizable problem in held-out evaluation under temporal constraints. When held-out positive examples include the chronologically earliest one in the eligible universe, time-controlled training has no out-of-sample data to consume.</w:t>
       </w:r>
     </w:p>
     <w:p>
@@ -5214,7 +5214,7 @@
           <w:sz w:val="24"/>
           <w:szCs w:val="24"/>
         </w:rPr>
-        <w:t xml:space="preserve">The TF-IDF + SVD32 baseline matches the autoencoder on Valeant and WorldCom and outperforms it on Lehman, HealthSouth, and Tyco. On Lehman, the trivial baseline lands the fraud at rank 1 of 13 with MW p ≈ 5 × 10⁻²² and rank-biserial +0.19, both stronger than the autoencoder. Aggregate hit-rates for the trivial baseline are hit@1 = 0.20, hit@3 = 0.20, hit@5 = 0.40. This is the only configuration in this study that exceeds the random baseline at any k.</w:t>
+        <w:t xml:space="preserve">The TF-IDF + SVD32 baseline matches the autoencoder on Valeant and WorldCom and outperforms it on Lehman, HealthSouth, and Tyco. On Lehman, the trivial baseline lands the fraud at rank 1 of 13 with MW p ≈ 5 × 10⁻²² and rank-biserial +0.19, both stronger than the autoencoder. Aggregate hit-rates for the trivial baseline are hit@1 = 0.20, hit@3 = 0.20, hit@5 = 0.40. No other configuration in this study exceeds the random baseline at any k.</w:t>
       </w:r>
     </w:p>
     <w:p>
@@ -5244,7 +5244,7 @@
           <w:sz w:val="28"/>
           <w:szCs w:val="28"/>
         </w:rPr>
-        <w:t xml:space="preserve">7.4 Lehman's positive result is robust to entity masking</w:t>
+        <w:t xml:space="preserve">7.4 Lehman's positive result is unchanged by entity masking</w:t>
       </w:r>
     </w:p>
     <w:p>
@@ -6296,7 +6296,7 @@
           <w:sz w:val="24"/>
           <w:szCs w:val="24"/>
         </w:rPr>
-        <w:t xml:space="preserve">Second, the pre-registered design was infeasible for Enron under LOCO + time-controlled training because the chronologically earliest held-out positive has no eligible training data. That is a finding about pre-registration discipline, not fraud-detection capability. It is also a generalizable lesson: any held-out evaluation under temporal constraints must verify that every held-out positive admits at least one eligible training cohort under the proposed rule before the spec is frozen.</w:t>
+        <w:t xml:space="preserve">Second, the pre-registered design was infeasible for Enron under LOCO + time-controlled training because the chronologically earliest held-out positive has no eligible training data. That is a finding about pre-registration discipline, not fraud-detection capability. The second finding is also a generalizable lesson: any held-out evaluation under temporal constraints must verify that every held-out positive admits at least one eligible training cohort under the proposed rule before the spec is frozen.</w:t>
       </w:r>
     </w:p>
     <w:p>

</xml_diff>